<commit_message>
Translation of the template
</commit_message>
<xml_diff>
--- a/PSIV-Template.docx
+++ b/PSIV-Template.docx
@@ -65,14 +65,18 @@
         </w:rPr>
         <w:t xml:space="preserve">, Michał </w:t>
       </w:r>
-      <w:proofErr w:type="spellStart"/>
       <w:r>
         <w:rPr>
           <w:lang w:val="pl-PL"/>
         </w:rPr>
-        <w:t>Zarowski</w:t>
-      </w:r>
-      <w:proofErr w:type="spellEnd"/>
+        <w:t>Ż</w:t>
+      </w:r>
+      <w:r>
+        <w:rPr>
+          <w:lang w:val="pl-PL"/>
+        </w:rPr>
+        <w:t>arowski</w:t>
+      </w:r>
       <w:r>
         <w:rPr>
           <w:lang w:val="pl-PL"/>

</xml_diff>